<commit_message>
Thêm sổ tay ngày demo cho buổi ráp ba máy
Gom toàn bộ việc phải làm khi ba máy ngồi cùng một chỗ vào một tài liệu
theo trình tự thời gian, kèm số liệu mong đợi ở từng bước và lời thoại
cho phần trình bày. Trọng tâm là giai đoạn 4 - đúng yêu cầu bắt buộc của
đề bài về điều chuyển 50 sản phẩm và xử lý nhất quán khi thất bại.

Sửa hai lỗi của bộ chuyển markdown sang Word: dòng liền nhau giờ được
gộp thành một đoạn nên cụm in đậm viết vắt qua hai dòng không còn bị đứt
đôi làm lọt dấu sao ra ngoài; khối trích dẫn cũng vậy và bỏ luôn cặp sao
bọc ngoài vì cả khối đã in nghiêng sẵn.

Co-Authored-By: Claude Opus 5 <noreply@anthropic.com>
</commit_message>
<xml_diff>
--- a/Do an cuoi ki/GUI_CHO_BAN_KHO_B.docx
+++ b/Do an cuoi ki/GUI_CHO_BAN_KHO_B.docx
@@ -26,8 +26,9 @@
         <w:pBdr>
           <w:left w:val="single" w:sz="12" w:space="8" w:color="F0A500"/>
         </w:pBdr>
-        <w:spacing w:after="60" w:line="300" w:lineRule="auto"/>
+        <w:spacing w:after="100" w:line="300" w:lineRule="auto"/>
         <w:ind w:left="360"/>
+        <w:jc w:val="both"/>
       </w:pPr>
       <w:r>
         <w:rPr>
@@ -50,7 +51,23 @@
           <w:i/>
           <w:iCs/>
         </w:rPr>
-        <w:t xml:space="preserve"> (Kho Miền Bắc, Bắc Ninh) trong đồ án CSDL phân tán của nhóm.</w:t>
+        <w:t xml:space="preserve"> (Kho Miền Bắc, Bắc Ninh) trong đồ án CSDL phân tán của nhóm. Hôm lên lớp ba máy nối với nhau là chạy được ngay — nhưng phải </w:t>
+      </w:r>
+      <w:r>
+        <w:rPr>
+          <w:b/>
+          <w:bCs/>
+          <w:i/>
+          <w:iCs/>
+        </w:rPr>
+        <w:t>cài sẵn ở nhà</w:t>
+      </w:r>
+      <w:r>
+        <w:rPr>
+          <w:i/>
+          <w:iCs/>
+        </w:rPr>
+        <w:t>, vì riêng việc tải SQL Server đã mất gần một tiếng.</w:t>
       </w:r>
     </w:p>
     <w:p>
@@ -58,68 +75,9 @@
         <w:pBdr>
           <w:left w:val="single" w:sz="12" w:space="8" w:color="F0A500"/>
         </w:pBdr>
-        <w:spacing w:after="60" w:line="300" w:lineRule="auto"/>
+        <w:spacing w:after="100" w:line="300" w:lineRule="auto"/>
         <w:ind w:left="360"/>
-      </w:pPr>
-      <w:r>
-        <w:rPr>
-          <w:i/>
-          <w:iCs/>
-        </w:rPr>
-        <w:t xml:space="preserve">Hôm lên lớp ba máy nối với nhau là chạy được ngay — nhưng phải </w:t>
-      </w:r>
-      <w:r>
-        <w:rPr>
-          <w:b/>
-          <w:bCs/>
-          <w:i/>
-          <w:iCs/>
-        </w:rPr>
-        <w:t>cài sẵn ở nhà</w:t>
-      </w:r>
-      <w:r>
-        <w:rPr>
-          <w:i/>
-          <w:iCs/>
-        </w:rPr>
-        <w:t>,</w:t>
-      </w:r>
-    </w:p>
-    <w:p>
-      <w:pPr>
-        <w:pBdr>
-          <w:left w:val="single" w:sz="12" w:space="8" w:color="F0A500"/>
-        </w:pBdr>
-        <w:spacing w:after="60" w:line="300" w:lineRule="auto"/>
-        <w:ind w:left="360"/>
-      </w:pPr>
-      <w:r>
-        <w:rPr>
-          <w:i/>
-          <w:iCs/>
-        </w:rPr>
-        <w:t>vì riêng việc tải SQL Server đã mất gần một tiếng.</w:t>
-      </w:r>
-    </w:p>
-    <w:p>
-      <w:pPr>
-        <w:pBdr>
-          <w:left w:val="single" w:sz="12" w:space="8" w:color="F0A500"/>
-        </w:pBdr>
-        <w:spacing w:after="60" w:line="300" w:lineRule="auto"/>
-        <w:ind w:left="360"/>
-      </w:pPr>
-      <w:r>
-        <w:t xml:space="preserve"> </w:t>
-      </w:r>
-    </w:p>
-    <w:p>
-      <w:pPr>
-        <w:pBdr>
-          <w:left w:val="single" w:sz="12" w:space="8" w:color="F0A500"/>
-        </w:pBdr>
-        <w:spacing w:after="60" w:line="300" w:lineRule="auto"/>
-        <w:ind w:left="360"/>
+        <w:jc w:val="both"/>
       </w:pPr>
       <w:r>
         <w:rPr>
@@ -172,7 +130,7 @@
           <w:left w:w="10" w:type="dxa"/>
           <w:right w:w="10" w:type="dxa"/>
         </w:tblCellMar>
-        <w:tblLook w:val="0000" w:firstRow="0" w:lastRow="0" w:firstColumn="0" w:lastColumn="0" w:noHBand="0" w:noVBand="0"/>
+        <w:tblLook w:val="04A0" w:firstRow="1" w:lastRow="0" w:firstColumn="1" w:lastColumn="0" w:noHBand="0" w:noVBand="1"/>
       </w:tblPr>
       <w:tblGrid>
         <w:gridCol w:w="4819"/>
@@ -467,16 +425,7 @@
         <w:t>điền sẵn đúng cho bạn</w:t>
       </w:r>
       <w:r>
-        <w:t xml:space="preserve"> —</w:t>
-      </w:r>
-    </w:p>
-    <w:p>
-      <w:pPr>
-        <w:spacing w:after="80" w:line="300" w:lineRule="auto"/>
-        <w:jc w:val="both"/>
-      </w:pPr>
-      <w:r>
-        <w:t>cứ chép nguyên, không phải sửa gì.</w:t>
+        <w:t xml:space="preserve"> — cứ chép nguyên, không phải sửa gì.</w:t>
       </w:r>
     </w:p>
     <w:p>
@@ -544,16 +493,7 @@
         <w:t>This PC</w:t>
       </w:r>
       <w:r>
-        <w:t xml:space="preserve"> xem ổ C hoặc ổ D còn bao nhiêu.</w:t>
-      </w:r>
-    </w:p>
-    <w:p>
-      <w:pPr>
-        <w:spacing w:after="80" w:line="300" w:lineRule="auto"/>
-        <w:jc w:val="both"/>
-      </w:pPr>
-      <w:r>
-        <w:t>Không đủ thì xoá bớt rồi hãy cài.</w:t>
+        <w:t xml:space="preserve"> xem ổ C hoặc ổ D còn bao nhiêu. Không đủ thì xoá bớt rồi hãy cài.</w:t>
       </w:r>
     </w:p>
     <w:p>
@@ -683,7 +623,6 @@
           <w:b/>
           <w:bCs/>
         </w:rPr>
-        <w:lastRenderedPageBreak/>
         <w:t xml:space="preserve">3. </w:t>
       </w:r>
       <w:r>
@@ -1359,14 +1298,8 @@
         <w:t>Manual</w:t>
       </w:r>
       <w:r>
-        <w:t xml:space="preserve"> thành</w:t>
-      </w:r>
-    </w:p>
-    <w:p>
-      <w:pPr>
-        <w:spacing w:after="80" w:line="300" w:lineRule="auto"/>
-        <w:jc w:val="both"/>
-      </w:pPr>
+        <w:t xml:space="preserve"> thành </w:t>
+      </w:r>
       <w:r>
         <w:rPr>
           <w:rFonts w:ascii="Consolas" w:eastAsia="Consolas" w:hAnsi="Consolas" w:cs="Consolas"/>
@@ -1565,6 +1498,7 @@
         <w:jc w:val="both"/>
       </w:pPr>
       <w:r>
+        <w:lastRenderedPageBreak/>
         <w:t xml:space="preserve">» </w:t>
       </w:r>
       <w:r>
@@ -2150,7 +2084,6 @@
           <w:sz w:val="16"/>
           <w:szCs w:val="16"/>
         </w:rPr>
-        <w:lastRenderedPageBreak/>
         <w:t>Restart-Service "MSSQL`$$Ten" -Force</w:t>
       </w:r>
     </w:p>
@@ -2250,6 +2183,7 @@
         <w:jc w:val="both"/>
       </w:pPr>
       <w:r>
+        <w:lastRenderedPageBreak/>
         <w:t xml:space="preserve">» </w:t>
       </w:r>
       <w:r>
@@ -2286,8 +2220,9 @@
         <w:pBdr>
           <w:left w:val="single" w:sz="12" w:space="8" w:color="F0A500"/>
         </w:pBdr>
-        <w:spacing w:after="60" w:line="300" w:lineRule="auto"/>
+        <w:spacing w:after="100" w:line="300" w:lineRule="auto"/>
         <w:ind w:left="360"/>
+        <w:jc w:val="both"/>
       </w:pPr>
       <w:r>
         <w:rPr>
@@ -2313,80 +2248,39 @@
           <w:i/>
           <w:iCs/>
         </w:rPr>
-        <w:t xml:space="preserve"> báo đỏ "Cannot find path ... MSSQL16.KHO_B" thì</w:t>
-      </w:r>
-    </w:p>
-    <w:p>
-      <w:pPr>
-        <w:pBdr>
-          <w:left w:val="single" w:sz="12" w:space="8" w:color="F0A500"/>
-        </w:pBdr>
-        <w:spacing w:after="60" w:line="300" w:lineRule="auto"/>
-        <w:ind w:left="360"/>
-      </w:pPr>
-      <w:r>
-        <w:rPr>
+        <w:t xml:space="preserve"> báo đỏ "Cannot find path ... MSSQL16.KHO_B" thì nghĩa là </w:t>
+      </w:r>
+      <w:r>
+        <w:rPr>
+          <w:b/>
+          <w:bCs/>
           <w:i/>
           <w:iCs/>
         </w:rPr>
-        <w:t xml:space="preserve">nghĩa là </w:t>
-      </w:r>
-      <w:r>
-        <w:rPr>
-          <w:b/>
-          <w:bCs/>
+        <w:t>tên instance bạn đặt không phải `KHO_B`</w:t>
+      </w:r>
+      <w:r>
+        <w:rPr>
           <w:i/>
           <w:iCs/>
         </w:rPr>
-        <w:t>tên instance bạn đặt không phải `KHO_B`</w:t>
-      </w:r>
-      <w:r>
-        <w:rPr>
+        <w:t xml:space="preserve">. Mở </w:t>
+      </w:r>
+      <w:r>
+        <w:rPr>
+          <w:b/>
+          <w:bCs/>
           <w:i/>
           <w:iCs/>
         </w:rPr>
-        <w:t>. Mở</w:t>
-      </w:r>
-    </w:p>
-    <w:p>
-      <w:pPr>
-        <w:pBdr>
-          <w:left w:val="single" w:sz="12" w:space="8" w:color="F0A500"/>
-        </w:pBdr>
-        <w:spacing w:after="60" w:line="300" w:lineRule="auto"/>
-        <w:ind w:left="360"/>
-      </w:pPr>
-      <w:r>
-        <w:rPr>
-          <w:b/>
-          <w:bCs/>
+        <w:t>SQL Server Configuration Manager</w:t>
+      </w:r>
+      <w:r>
+        <w:rPr>
           <w:i/>
           <w:iCs/>
         </w:rPr>
-        <w:t>SQL Server Configuration Manager</w:t>
-      </w:r>
-      <w:r>
-        <w:rPr>
-          <w:i/>
-          <w:iCs/>
-        </w:rPr>
-        <w:t xml:space="preserve"> xem tên thật rồi cài lại cho đúng —</w:t>
-      </w:r>
-    </w:p>
-    <w:p>
-      <w:pPr>
-        <w:pBdr>
-          <w:left w:val="single" w:sz="12" w:space="8" w:color="F0A500"/>
-        </w:pBdr>
-        <w:spacing w:after="60" w:line="300" w:lineRule="auto"/>
-        <w:ind w:left="360"/>
-      </w:pPr>
-      <w:r>
-        <w:rPr>
-          <w:i/>
-          <w:iCs/>
-        </w:rPr>
-        <w:t>các script của nhóm gọi đích danh tên này nên không được đặt khác.</w:t>
+        <w:t xml:space="preserve"> xem tên thật rồi cài lại cho đúng — các script của nhóm gọi đích danh tên này nên không được đặt khác.</w:t>
       </w:r>
     </w:p>
     <w:p>
@@ -2449,16 +2343,7 @@
         <w:t>chuyển hàng giữa hai kho mà không mất hàng giữa chừng</w:t>
       </w:r>
       <w:r>
-        <w:t>.</w:t>
-      </w:r>
-    </w:p>
-    <w:p>
-      <w:pPr>
-        <w:spacing w:after="80" w:line="300" w:lineRule="auto"/>
-        <w:jc w:val="both"/>
-      </w:pPr>
-      <w:r>
-        <w:t>Không mở thì phần quan trọng nhất của đồ án chạy không được.</w:t>
+        <w:t>. Không mở thì phần quan trọng nhất của đồ án chạy không được.</w:t>
       </w:r>
     </w:p>
     <w:p>
@@ -2561,14 +2446,8 @@
         <w:t>My Computer</w:t>
       </w:r>
       <w:r>
-        <w:t xml:space="preserve"> →</w:t>
-      </w:r>
-    </w:p>
-    <w:p>
-      <w:pPr>
-        <w:spacing w:after="80" w:line="300" w:lineRule="auto"/>
-        <w:jc w:val="both"/>
-      </w:pPr>
+        <w:t xml:space="preserve"> → </w:t>
+      </w:r>
       <w:r>
         <w:rPr>
           <w:b/>
@@ -2822,7 +2701,6 @@
           <w:sz w:val="28"/>
           <w:szCs w:val="28"/>
         </w:rPr>
-        <w:lastRenderedPageBreak/>
         <w:t>BƯỚC 7 — Cài ZeroTier và vào mạng của nhóm</w:t>
       </w:r>
     </w:p>
@@ -2991,6 +2869,7 @@
           <w:b/>
           <w:bCs/>
         </w:rPr>
+        <w:lastRenderedPageBreak/>
         <w:t xml:space="preserve">5. </w:t>
       </w:r>
       <w:r>
@@ -3164,16 +3043,7 @@
         <w:t>.\KHO_B</w:t>
       </w:r>
       <w:r>
-        <w:t xml:space="preserve"> (có dấu chấm và dấu gạch chéo ngược) →</w:t>
-      </w:r>
-    </w:p>
-    <w:p>
-      <w:pPr>
-        <w:spacing w:after="80" w:line="300" w:lineRule="auto"/>
-        <w:jc w:val="both"/>
-      </w:pPr>
-      <w:r>
-        <w:t xml:space="preserve">bấm </w:t>
+        <w:t xml:space="preserve"> (có dấu chấm và dấu gạch chéo ngược) → bấm </w:t>
       </w:r>
       <w:r>
         <w:rPr>
@@ -3428,7 +3298,6 @@
         <w:ind w:left="431" w:hanging="316"/>
       </w:pPr>
       <w:r>
-        <w:lastRenderedPageBreak/>
         <w:t xml:space="preserve">[  ]  </w:t>
       </w:r>
       <w:r>
@@ -3575,14 +3444,16 @@
         <w:pBdr>
           <w:left w:val="single" w:sz="12" w:space="8" w:color="F0A500"/>
         </w:pBdr>
-        <w:spacing w:after="60" w:line="300" w:lineRule="auto"/>
+        <w:spacing w:after="100" w:line="300" w:lineRule="auto"/>
         <w:ind w:left="360"/>
+        <w:jc w:val="both"/>
       </w:pPr>
       <w:r>
         <w:rPr>
           <w:i/>
           <w:iCs/>
         </w:rPr>
+        <w:lastRenderedPageBreak/>
         <w:t xml:space="preserve">Tổng thời gian khoảng </w:t>
       </w:r>
       <w:r>
@@ -3599,23 +3470,7 @@
           <w:i/>
           <w:iCs/>
         </w:rPr>
-        <w:t>, phần lớn là ngồi chờ tải và cài.</w:t>
-      </w:r>
-    </w:p>
-    <w:p>
-      <w:pPr>
-        <w:pBdr>
-          <w:left w:val="single" w:sz="12" w:space="8" w:color="F0A500"/>
-        </w:pBdr>
-        <w:spacing w:after="60" w:line="300" w:lineRule="auto"/>
-        <w:ind w:left="360"/>
-      </w:pPr>
-      <w:r>
-        <w:rPr>
-          <w:i/>
-          <w:iCs/>
-        </w:rPr>
-        <w:t>Làm xong ở nhà thì hôm lên lớp chỉ mất 30 phút là cả nhóm demo được.</w:t>
+        <w:t>, phần lớn là ngồi chờ tải và cài. Làm xong ở nhà thì hôm lên lớp chỉ mất 30 phút là cả nhóm demo được.</w:t>
       </w:r>
     </w:p>
     <w:p>
@@ -4038,10 +3893,10 @@
 <file path=word/numbering.xml><?xml version="1.0" encoding="utf-8"?>
 <w:numbering xmlns:wpc="http://schemas.microsoft.com/office/word/2010/wordprocessingCanvas" xmlns:cx="http://schemas.microsoft.com/office/drawing/2014/chartex" xmlns:cx1="http://schemas.microsoft.com/office/drawing/2015/9/8/chartex" xmlns:cx2="http://schemas.microsoft.com/office/drawing/2015/10/21/chartex" xmlns:cx3="http://schemas.microsoft.com/office/drawing/2016/5/9/chartex" xmlns:cx4="http://schemas.microsoft.com/office/drawing/2016/5/10/chartex" xmlns:cx5="http://schemas.microsoft.com/office/drawing/2016/5/11/chartex" xmlns:cx6="http://schemas.microsoft.com/office/drawing/2016/5/12/chartex" xmlns:cx7="http://schemas.microsoft.com/office/drawing/2016/5/13/chartex" xmlns:cx8="http://schemas.microsoft.com/office/drawing/2016/5/14/chartex" xmlns:mc="http://schemas.openxmlformats.org/markup-compatibility/2006" xmlns:aink="http://schemas.microsoft.com/office/drawing/2016/ink" xmlns:am3d="http://schemas.microsoft.com/office/drawing/2017/model3d" xmlns:o="urn:schemas-microsoft-com:office:office" xmlns:oel="http://schemas.microsoft.com/office/2019/extlst" xmlns:r="http://schemas.openxmlformats.org/officeDocument/2006/relationships" xmlns:m="http://schemas.openxmlformats.org/officeDocument/2006/math" xmlns:v="urn:schemas-microsoft-com:vml" xmlns:wp14="http://schemas.microsoft.com/office/word/2010/wordprocessingDrawing" xmlns:wp="http://schemas.openxmlformats.org/drawingml/2006/wordprocessingDrawing" xmlns:w10="urn:schemas-microsoft-com:office:word" xmlns:w="http://schemas.openxmlformats.org/wordprocessingml/2006/main" xmlns:w14="http://schemas.microsoft.com/office/word/2010/wordml" xmlns:w15="http://schemas.microsoft.com/office/word/2012/wordml" xmlns:w16cex="http://schemas.microsoft.com/office/word/2018/wordml/cex" xmlns:w16cid="http://schemas.microsoft.com/office/word/2016/wordml/cid" xmlns:w16="http://schemas.microsoft.com/office/word/2018/wordml" xmlns:w16du="http://schemas.microsoft.com/office/word/2023/wordml/word16du" xmlns:w16sdtdh="http://schemas.microsoft.com/office/word/2020/wordml/sdtdatahash" xmlns:w16sdtfl="http://schemas.microsoft.com/office/word/2024/wordml/sdtformatlock" xmlns:w16se="http://schemas.microsoft.com/office/word/2015/wordml/symex" xmlns:wpg="http://schemas.microsoft.com/office/word/2010/wordprocessingGroup" xmlns:wpi="http://schemas.microsoft.com/office/word/2010/wordprocessingInk" xmlns:wne="http://schemas.microsoft.com/office/word/2006/wordml" xmlns:wps="http://schemas.microsoft.com/office/word/2010/wordprocessingShape" mc:Ignorable="w14 w15 w16se w16cid w16 w16cex w16sdtdh w16sdtfl w16du wp14">
   <w:abstractNum w:abstractNumId="0" w15:restartNumberingAfterBreak="0">
-    <w:nsid w:val="78F947D1"/>
+    <w:nsid w:val="715B7913"/>
     <w:multiLevelType w:val="hybridMultilevel"/>
-    <w:tmpl w:val="424A5AFA"/>
-    <w:lvl w:ilvl="0" w:tplc="9B383AB8">
+    <w:tmpl w:val="6060BBD0"/>
+    <w:lvl w:ilvl="0" w:tplc="CC184698">
       <w:start w:val="1"/>
       <w:numFmt w:val="bullet"/>
       <w:lvlText w:val="●"/>
@@ -4050,7 +3905,7 @@
         <w:ind w:left="720" w:hanging="360"/>
       </w:pPr>
     </w:lvl>
-    <w:lvl w:ilvl="1" w:tplc="F228B32E">
+    <w:lvl w:ilvl="1" w:tplc="8BCC7668">
       <w:start w:val="1"/>
       <w:numFmt w:val="bullet"/>
       <w:lvlText w:val="○"/>
@@ -4059,7 +3914,7 @@
         <w:ind w:left="1440" w:hanging="360"/>
       </w:pPr>
     </w:lvl>
-    <w:lvl w:ilvl="2" w:tplc="622E120E">
+    <w:lvl w:ilvl="2" w:tplc="06FC505E">
       <w:start w:val="1"/>
       <w:numFmt w:val="bullet"/>
       <w:lvlText w:val="■"/>
@@ -4068,7 +3923,7 @@
         <w:ind w:left="2160" w:hanging="360"/>
       </w:pPr>
     </w:lvl>
-    <w:lvl w:ilvl="3" w:tplc="28F6D056">
+    <w:lvl w:ilvl="3" w:tplc="79D667C8">
       <w:start w:val="1"/>
       <w:numFmt w:val="bullet"/>
       <w:lvlText w:val="●"/>
@@ -4077,7 +3932,7 @@
         <w:ind w:left="2880" w:hanging="360"/>
       </w:pPr>
     </w:lvl>
-    <w:lvl w:ilvl="4" w:tplc="F8C41802">
+    <w:lvl w:ilvl="4" w:tplc="BA90AD50">
       <w:start w:val="1"/>
       <w:numFmt w:val="bullet"/>
       <w:lvlText w:val="○"/>
@@ -4086,7 +3941,7 @@
         <w:ind w:left="3600" w:hanging="360"/>
       </w:pPr>
     </w:lvl>
-    <w:lvl w:ilvl="5" w:tplc="4D8EAA52">
+    <w:lvl w:ilvl="5" w:tplc="6944CC02">
       <w:start w:val="1"/>
       <w:numFmt w:val="bullet"/>
       <w:lvlText w:val="■"/>
@@ -4095,7 +3950,7 @@
         <w:ind w:left="4320" w:hanging="360"/>
       </w:pPr>
     </w:lvl>
-    <w:lvl w:ilvl="6" w:tplc="A10E1872">
+    <w:lvl w:ilvl="6" w:tplc="F3C686CE">
       <w:start w:val="1"/>
       <w:numFmt w:val="bullet"/>
       <w:lvlText w:val="●"/>
@@ -4104,7 +3959,7 @@
         <w:ind w:left="5040" w:hanging="360"/>
       </w:pPr>
     </w:lvl>
-    <w:lvl w:ilvl="7" w:tplc="1A688D18">
+    <w:lvl w:ilvl="7" w:tplc="19B82DAA">
       <w:start w:val="1"/>
       <w:numFmt w:val="bullet"/>
       <w:lvlText w:val="●"/>
@@ -4113,7 +3968,7 @@
         <w:ind w:left="5760" w:hanging="360"/>
       </w:pPr>
     </w:lvl>
-    <w:lvl w:ilvl="8" w:tplc="612A0072">
+    <w:lvl w:ilvl="8" w:tplc="2C6C7E9C">
       <w:start w:val="1"/>
       <w:numFmt w:val="bullet"/>
       <w:lvlText w:val="●"/>
@@ -4123,7 +3978,7 @@
       </w:pPr>
     </w:lvl>
   </w:abstractNum>
-  <w:num w:numId="1" w16cid:durableId="628895702">
+  <w:num w:numId="1" w16cid:durableId="126048613">
     <w:abstractNumId w:val="0"/>
     <w:lvlOverride w:ilvl="0">
       <w:startOverride w:val="1"/>

</xml_diff>

<commit_message>
Nói rõ ảnh trong hướng dẫn không phải để nộp báo cáo
Bạn bè đọc thấy dấu máy ảnh dễ tưởng phải chụp cho đủ để nhóm trưởng bỏ
vào cuốn báo cáo, trong khi 53 ảnh minh chứng đã chụp xong từ lâu, kể cả
mười ảnh cài đặt SQL Server. Ảnh họ chụp chỉ để nhóm trưởng soát xem có
đặt đúng tên instance và mật khẩu hay không - sai thì còn kịp sửa ở nhà.

Đánh dấu bước 8 là bắt buộc, vì thiếu tên máy chủ và IP ảo thì hôm lên
lớp không nối được ba máy.

Co-Authored-By: Claude Opus 5 <noreply@anthropic.com>
</commit_message>
<xml_diff>
--- a/Do an cuoi ki/GUI_CHO_BAN_KHO_B.docx
+++ b/Do an cuoi ki/GUI_CHO_BAN_KHO_B.docx
@@ -133,7 +133,7 @@
           <w:left w:w="10" w:type="dxa"/>
           <w:right w:w="10" w:type="dxa"/>
         </w:tblCellMar>
-        <w:tblLook w:val="0000" w:firstRow="0" w:lastRow="0" w:firstColumn="0" w:lastColumn="0" w:noHBand="0" w:noVBand="0"/>
+        <w:tblLook w:val="04A0" w:firstRow="1" w:lastRow="0" w:firstColumn="1" w:lastColumn="0" w:noHBand="0" w:noVBand="1"/>
       </w:tblPr>
       <w:tblGrid>
         <w:gridCol w:w="4819"/>
@@ -625,6 +625,99 @@
           <w:sz w:val="28"/>
           <w:szCs w:val="28"/>
         </w:rPr>
+        <w:t xml:space="preserve">Về những chỗ có dấu » </w:t>
+      </w:r>
+    </w:p>
+    <w:p>
+      <w:pPr>
+        <w:spacing w:after="60"/>
+      </w:pPr>
+    </w:p>
+    <w:p>
+      <w:pPr>
+        <w:spacing w:after="80" w:line="300" w:lineRule="auto"/>
+        <w:jc w:val="both"/>
+      </w:pPr>
+      <w:r>
+        <w:t xml:space="preserve">Ảnh minh chứng cho cuốn báo cáo </w:t>
+      </w:r>
+      <w:r>
+        <w:rPr>
+          <w:b/>
+          <w:bCs/>
+        </w:rPr>
+        <w:t>nhóm trưởng đã chụp đủ rồi</w:t>
+      </w:r>
+      <w:r>
+        <w:t xml:space="preserve">, bạn không phải chụp để nộp. Những chỗ đánh dấu » dưới đây là </w:t>
+      </w:r>
+      <w:r>
+        <w:rPr>
+          <w:b/>
+          <w:bCs/>
+        </w:rPr>
+        <w:t>chụp gửi nhóm trưởng kiểm tra giùm</w:t>
+      </w:r>
+      <w:r>
+        <w:t xml:space="preserve"> — để bạn ấy soát xem bạn có đặt đúng tên instance, đúng mật khẩu, có bật đúng dịch vụ hay không.</w:t>
+      </w:r>
+    </w:p>
+    <w:p>
+      <w:pPr>
+        <w:spacing w:after="60"/>
+      </w:pPr>
+    </w:p>
+    <w:p>
+      <w:pPr>
+        <w:spacing w:after="80" w:line="300" w:lineRule="auto"/>
+        <w:jc w:val="both"/>
+      </w:pPr>
+      <w:r>
+        <w:t>Phát hiện sai ở nhà thì sửa kịp. Để hôm lên lớp mới lòi ra thì không cứu được, vì cài lại SQL Server mất hơn một tiếng.</w:t>
+      </w:r>
+    </w:p>
+    <w:p>
+      <w:pPr>
+        <w:spacing w:after="60"/>
+      </w:pPr>
+    </w:p>
+    <w:p>
+      <w:pPr>
+        <w:spacing w:after="80" w:line="300" w:lineRule="auto"/>
+        <w:jc w:val="both"/>
+      </w:pPr>
+      <w:r>
+        <w:t xml:space="preserve">Ngại chụp thì thôi cũng được, nhưng </w:t>
+      </w:r>
+      <w:r>
+        <w:rPr>
+          <w:b/>
+          <w:bCs/>
+        </w:rPr>
+        <w:t>bước 8 thì bắt buộc phải gửi</w:t>
+      </w:r>
+      <w:r>
+        <w:t>.</w:t>
+      </w:r>
+    </w:p>
+    <w:p>
+      <w:pPr>
+        <w:spacing w:after="60"/>
+      </w:pPr>
+    </w:p>
+    <w:p>
+      <w:pPr>
+        <w:pStyle w:val="Heading2"/>
+        <w:spacing w:before="220" w:after="120"/>
+      </w:pPr>
+      <w:r>
+        <w:rPr>
+          <w:b/>
+          <w:bCs/>
+          <w:color w:val="1F3864"/>
+          <w:sz w:val="28"/>
+          <w:szCs w:val="28"/>
+        </w:rPr>
         <w:t>Bạn KHÔNG cần chuẩn bị gì thêm</w:t>
       </w:r>
     </w:p>
@@ -1272,6 +1365,7 @@
         <w:jc w:val="both"/>
       </w:pPr>
       <w:r>
+        <w:lastRenderedPageBreak/>
         <w:t>→ Next</w:t>
       </w:r>
     </w:p>
@@ -1546,7 +1640,6 @@
         <w:jc w:val="both"/>
       </w:pPr>
       <w:r>
-        <w:lastRenderedPageBreak/>
         <w:t xml:space="preserve">» </w:t>
       </w:r>
       <w:r>
@@ -2582,6 +2675,7 @@
         <w:jc w:val="both"/>
       </w:pPr>
       <w:r>
+        <w:lastRenderedPageBreak/>
         <w:t xml:space="preserve">Đây là thứ cho phép </w:t>
       </w:r>
       <w:r>
@@ -2872,7 +2966,6 @@
           <w:b/>
           <w:bCs/>
         </w:rPr>
-        <w:lastRenderedPageBreak/>
         <w:t xml:space="preserve">5. </w:t>
       </w:r>
       <w:r>
@@ -2914,10 +3007,10 @@
           <w:b/>
           <w:bCs/>
         </w:rPr>
-        <w:t>CHỤP MÀN HÌNH TAB SECURITY NÀY</w:t>
-      </w:r>
-      <w:r>
-        <w:t xml:space="preserve"> — dùng cho báo cáo.</w:t>
+        <w:t>Chụp tab Security này</w:t>
+      </w:r>
+      <w:r>
+        <w:t xml:space="preserve"> gửi nhóm trưởng — đây là chỗ hay tick thiếu nhất.</w:t>
       </w:r>
     </w:p>
     <w:p>
@@ -3276,6 +3369,7 @@
         <w:jc w:val="both"/>
       </w:pPr>
       <w:r>
+        <w:lastRenderedPageBreak/>
         <w:t xml:space="preserve">» </w:t>
       </w:r>
       <w:r>
@@ -3317,7 +3411,7 @@
           <w:sz w:val="28"/>
           <w:szCs w:val="28"/>
         </w:rPr>
-        <w:t>BƯỚC 8 — Báo lại cho nhóm trưởng</w:t>
+        <w:t>BƯỚC 8 — Báo lại cho nhóm trưởng BẮT BUỘC</w:t>
       </w:r>
     </w:p>
     <w:p>
@@ -3427,7 +3521,6 @@
         <w:jc w:val="both"/>
       </w:pPr>
       <w:r>
-        <w:lastRenderedPageBreak/>
         <w:t xml:space="preserve">Gửi nhóm trưởng </w:t>
       </w:r>
       <w:r>
@@ -3487,7 +3580,7 @@
           <w:sz w:val="16"/>
           <w:szCs w:val="16"/>
         </w:rPr>
-        <w:t>3. Anh chup cac buoc co dau may anh o tren</w:t>
+        <w:t>3. Anh chup cac buoc o tren (neu co, de nhom truong soat giup)</w:t>
       </w:r>
     </w:p>
     <w:p>
@@ -3544,7 +3637,7 @@
           <w:left w:w="10" w:type="dxa"/>
           <w:right w:w="10" w:type="dxa"/>
         </w:tblCellMar>
-        <w:tblLook w:val="0000" w:firstRow="0" w:lastRow="0" w:firstColumn="0" w:lastColumn="0" w:noHBand="0" w:noVBand="0"/>
+        <w:tblLook w:val="04A0" w:firstRow="1" w:lastRow="0" w:firstColumn="1" w:lastColumn="0" w:noHBand="0" w:noVBand="1"/>
       </w:tblPr>
       <w:tblGrid>
         <w:gridCol w:w="3212"/>
@@ -4166,6 +4259,7 @@
         <w:ind w:left="431" w:hanging="316"/>
       </w:pPr>
       <w:r>
+        <w:lastRenderedPageBreak/>
         <w:t xml:space="preserve">[  ]  </w:t>
       </w:r>
       <w:r>
@@ -4887,10 +4981,10 @@
 <file path=word/numbering.xml><?xml version="1.0" encoding="utf-8"?>
 <w:numbering xmlns:wpc="http://schemas.microsoft.com/office/word/2010/wordprocessingCanvas" xmlns:cx="http://schemas.microsoft.com/office/drawing/2014/chartex" xmlns:cx1="http://schemas.microsoft.com/office/drawing/2015/9/8/chartex" xmlns:cx2="http://schemas.microsoft.com/office/drawing/2015/10/21/chartex" xmlns:cx3="http://schemas.microsoft.com/office/drawing/2016/5/9/chartex" xmlns:cx4="http://schemas.microsoft.com/office/drawing/2016/5/10/chartex" xmlns:cx5="http://schemas.microsoft.com/office/drawing/2016/5/11/chartex" xmlns:cx6="http://schemas.microsoft.com/office/drawing/2016/5/12/chartex" xmlns:cx7="http://schemas.microsoft.com/office/drawing/2016/5/13/chartex" xmlns:cx8="http://schemas.microsoft.com/office/drawing/2016/5/14/chartex" xmlns:mc="http://schemas.openxmlformats.org/markup-compatibility/2006" xmlns:aink="http://schemas.microsoft.com/office/drawing/2016/ink" xmlns:am3d="http://schemas.microsoft.com/office/drawing/2017/model3d" xmlns:o="urn:schemas-microsoft-com:office:office" xmlns:oel="http://schemas.microsoft.com/office/2019/extlst" xmlns:r="http://schemas.openxmlformats.org/officeDocument/2006/relationships" xmlns:m="http://schemas.openxmlformats.org/officeDocument/2006/math" xmlns:v="urn:schemas-microsoft-com:vml" xmlns:wp14="http://schemas.microsoft.com/office/word/2010/wordprocessingDrawing" xmlns:wp="http://schemas.openxmlformats.org/drawingml/2006/wordprocessingDrawing" xmlns:w10="urn:schemas-microsoft-com:office:word" xmlns:w="http://schemas.openxmlformats.org/wordprocessingml/2006/main" xmlns:w14="http://schemas.microsoft.com/office/word/2010/wordml" xmlns:w15="http://schemas.microsoft.com/office/word/2012/wordml" xmlns:w16cex="http://schemas.microsoft.com/office/word/2018/wordml/cex" xmlns:w16cid="http://schemas.microsoft.com/office/word/2016/wordml/cid" xmlns:w16="http://schemas.microsoft.com/office/word/2018/wordml" xmlns:w16du="http://schemas.microsoft.com/office/word/2023/wordml/word16du" xmlns:w16sdtdh="http://schemas.microsoft.com/office/word/2020/wordml/sdtdatahash" xmlns:w16sdtfl="http://schemas.microsoft.com/office/word/2024/wordml/sdtformatlock" xmlns:w16se="http://schemas.microsoft.com/office/word/2015/wordml/symex" xmlns:wpg="http://schemas.microsoft.com/office/word/2010/wordprocessingGroup" xmlns:wpi="http://schemas.microsoft.com/office/word/2010/wordprocessingInk" xmlns:wne="http://schemas.microsoft.com/office/word/2006/wordml" xmlns:wps="http://schemas.microsoft.com/office/word/2010/wordprocessingShape" mc:Ignorable="w14 w15 w16se w16cid w16 w16cex w16sdtdh w16sdtfl w16du wp14">
   <w:abstractNum w:abstractNumId="0" w15:restartNumberingAfterBreak="0">
-    <w:nsid w:val="247A1EFF"/>
+    <w:nsid w:val="343762FD"/>
     <w:multiLevelType w:val="hybridMultilevel"/>
-    <w:tmpl w:val="565EB1F0"/>
-    <w:lvl w:ilvl="0" w:tplc="F5CAE824">
+    <w:tmpl w:val="D674A11A"/>
+    <w:lvl w:ilvl="0" w:tplc="F788C4C0">
       <w:start w:val="1"/>
       <w:numFmt w:val="bullet"/>
       <w:lvlText w:val="●"/>
@@ -4899,7 +4993,7 @@
         <w:ind w:left="720" w:hanging="360"/>
       </w:pPr>
     </w:lvl>
-    <w:lvl w:ilvl="1" w:tplc="4F20CF1E">
+    <w:lvl w:ilvl="1" w:tplc="9AA050CA">
       <w:start w:val="1"/>
       <w:numFmt w:val="bullet"/>
       <w:lvlText w:val="○"/>
@@ -4908,7 +5002,7 @@
         <w:ind w:left="1440" w:hanging="360"/>
       </w:pPr>
     </w:lvl>
-    <w:lvl w:ilvl="2" w:tplc="56A2F190">
+    <w:lvl w:ilvl="2" w:tplc="CF8E1274">
       <w:start w:val="1"/>
       <w:numFmt w:val="bullet"/>
       <w:lvlText w:val="■"/>
@@ -4917,7 +5011,7 @@
         <w:ind w:left="2160" w:hanging="360"/>
       </w:pPr>
     </w:lvl>
-    <w:lvl w:ilvl="3" w:tplc="B2AC2188">
+    <w:lvl w:ilvl="3" w:tplc="740C500E">
       <w:start w:val="1"/>
       <w:numFmt w:val="bullet"/>
       <w:lvlText w:val="●"/>
@@ -4926,7 +5020,7 @@
         <w:ind w:left="2880" w:hanging="360"/>
       </w:pPr>
     </w:lvl>
-    <w:lvl w:ilvl="4" w:tplc="D74E7DDC">
+    <w:lvl w:ilvl="4" w:tplc="9B0A39DA">
       <w:start w:val="1"/>
       <w:numFmt w:val="bullet"/>
       <w:lvlText w:val="○"/>
@@ -4935,7 +5029,7 @@
         <w:ind w:left="3600" w:hanging="360"/>
       </w:pPr>
     </w:lvl>
-    <w:lvl w:ilvl="5" w:tplc="CB1A4CDE">
+    <w:lvl w:ilvl="5" w:tplc="AEAC9DC6">
       <w:start w:val="1"/>
       <w:numFmt w:val="bullet"/>
       <w:lvlText w:val="■"/>
@@ -4944,7 +5038,7 @@
         <w:ind w:left="4320" w:hanging="360"/>
       </w:pPr>
     </w:lvl>
-    <w:lvl w:ilvl="6" w:tplc="2E40CDBC">
+    <w:lvl w:ilvl="6" w:tplc="657A9544">
       <w:start w:val="1"/>
       <w:numFmt w:val="bullet"/>
       <w:lvlText w:val="●"/>
@@ -4953,7 +5047,7 @@
         <w:ind w:left="5040" w:hanging="360"/>
       </w:pPr>
     </w:lvl>
-    <w:lvl w:ilvl="7" w:tplc="59A4541C">
+    <w:lvl w:ilvl="7" w:tplc="D82241A4">
       <w:start w:val="1"/>
       <w:numFmt w:val="bullet"/>
       <w:lvlText w:val="●"/>
@@ -4962,7 +5056,7 @@
         <w:ind w:left="5760" w:hanging="360"/>
       </w:pPr>
     </w:lvl>
-    <w:lvl w:ilvl="8" w:tplc="50321D1C">
+    <w:lvl w:ilvl="8" w:tplc="BF7E00D8">
       <w:start w:val="1"/>
       <w:numFmt w:val="bullet"/>
       <w:lvlText w:val="●"/>
@@ -4972,7 +5066,7 @@
       </w:pPr>
     </w:lvl>
   </w:abstractNum>
-  <w:num w:numId="1" w16cid:durableId="703864677">
+  <w:num w:numId="1" w16cid:durableId="2121875976">
     <w:abstractNumId w:val="0"/>
     <w:lvlOverride w:ilvl="0">
       <w:startOverride w:val="1"/>

</xml_diff>